<commit_message>
Updated portfolio with latest changes
</commit_message>
<xml_diff>
--- a/Emmanuel_CV.docx
+++ b/Emmanuel_CV.docx
@@ -1,6 +1,6 @@
 
 <file path=word/document.xml><?xml version="1.0" encoding="utf-8"?>
-<w:document xmlns:wpc="http://schemas.microsoft.com/office/word/2010/wordprocessingCanvas" xmlns:cx="http://schemas.microsoft.com/office/drawing/2014/chartex" xmlns:cx1="http://schemas.microsoft.com/office/drawing/2015/9/8/chartex" xmlns:cx2="http://schemas.microsoft.com/office/drawing/2015/10/21/chartex" xmlns:cx3="http://schemas.microsoft.com/office/drawing/2016/5/9/chartex" xmlns:cx4="http://schemas.microsoft.com/office/drawing/2016/5/10/chartex" xmlns:cx5="http://schemas.microsoft.com/office/drawing/2016/5/11/chartex" xmlns:cx6="http://schemas.microsoft.com/office/drawing/2016/5/12/chartex" xmlns:cx7="http://schemas.microsoft.com/office/drawing/2016/5/13/chartex" xmlns:cx8="http://schemas.microsoft.com/office/drawing/2016/5/14/chartex" xmlns:mc="http://schemas.openxmlformats.org/markup-compatibility/2006" xmlns:aink="http://schemas.microsoft.com/office/drawing/2016/ink" xmlns:am3d="http://schemas.microsoft.com/office/drawing/2017/model3d" xmlns:o="urn:schemas-microsoft-com:office:office" xmlns:oel="http://schemas.microsoft.com/office/2019/extlst" xmlns:r="http://schemas.openxmlformats.org/officeDocument/2006/relationships" xmlns:m="http://schemas.openxmlformats.org/officeDocument/2006/math" xmlns:v="urn:schemas-microsoft-com:vml" xmlns:wp14="http://schemas.microsoft.com/office/word/2010/wordprocessingDrawing" xmlns:wp="http://schemas.openxmlformats.org/drawingml/2006/wordprocessingDrawing" xmlns:w10="urn:schemas-microsoft-com:office:word" xmlns:w="http://schemas.openxmlformats.org/wordprocessingml/2006/main" xmlns:w14="http://schemas.microsoft.com/office/word/2010/wordml" xmlns:w15="http://schemas.microsoft.com/office/word/2012/wordml" xmlns:w16cex="http://schemas.microsoft.com/office/word/2018/wordml/cex" xmlns:w16cid="http://schemas.microsoft.com/office/word/2016/wordml/cid" xmlns:w16="http://schemas.microsoft.com/office/word/2018/wordml" xmlns:w16du="http://schemas.microsoft.com/office/word/2023/wordml/word16du" xmlns:w16sdtdh="http://schemas.microsoft.com/office/word/2020/wordml/sdtdatahash" xmlns:w16sdtfl="http://schemas.microsoft.com/office/word/2024/wordml/sdtformatlock" xmlns:w16se="http://schemas.microsoft.com/office/word/2015/wordml/symex" xmlns:wpg="http://schemas.microsoft.com/office/word/2010/wordprocessingGroup" xmlns:wpi="http://schemas.microsoft.com/office/word/2010/wordprocessingInk" xmlns:wne="http://schemas.microsoft.com/office/word/2006/wordml" xmlns:wps="http://schemas.microsoft.com/office/word/2010/wordprocessingShape" mc:Ignorable="w14 w15 w16se w16cid w16 w16cex w16sdtdh w16sdtfl w16du wp14">
+<w:document xmlns:wpc="http://schemas.microsoft.com/office/word/2010/wordprocessingCanvas" xmlns:cx="http://schemas.microsoft.com/office/drawing/2014/chartex" xmlns:mc="http://schemas.openxmlformats.org/markup-compatibility/2006" xmlns:o="urn:schemas-microsoft-com:office:office" xmlns:r="http://schemas.openxmlformats.org/officeDocument/2006/relationships" xmlns:m="http://schemas.openxmlformats.org/officeDocument/2006/math" xmlns:v="urn:schemas-microsoft-com:vml" xmlns:wp14="http://schemas.microsoft.com/office/word/2010/wordprocessingDrawing" xmlns:wp="http://schemas.openxmlformats.org/drawingml/2006/wordprocessingDrawing" xmlns:w10="urn:schemas-microsoft-com:office:word" xmlns:w="http://schemas.openxmlformats.org/wordprocessingml/2006/main" xmlns:w14="http://schemas.microsoft.com/office/word/2010/wordml" xmlns:w15="http://schemas.microsoft.com/office/word/2012/wordml" xmlns:w16se="http://schemas.microsoft.com/office/word/2015/wordml/symex" xmlns:wpg="http://schemas.microsoft.com/office/word/2010/wordprocessingGroup" xmlns:wpi="http://schemas.microsoft.com/office/word/2010/wordprocessingInk" xmlns:wne="http://schemas.microsoft.com/office/word/2006/wordml" xmlns:wps="http://schemas.microsoft.com/office/word/2010/wordprocessingShape" mc:Ignorable="w14 w15 w16se wp14">
   <w:body>
     <w:p>
       <w:pPr>
@@ -26,9 +26,9 @@
           <w:u w:val="single"/>
         </w:rPr>
         <w:drawing>
-          <wp:inline distT="0" distB="0" distL="0" distR="0" wp14:anchorId="213A7619" wp14:editId="4824C83D">
-            <wp:extent cx="2665459" cy="1399736"/>
-            <wp:effectExtent l="0" t="0" r="1905" b="0"/>
+          <wp:inline distT="0" distB="0" distL="0" distR="0" wp14:anchorId="213A7619" wp14:editId="7D4DAB7A">
+            <wp:extent cx="2665087" cy="1983544"/>
+            <wp:effectExtent l="0" t="0" r="2540" b="0"/>
             <wp:docPr id="2133505112" name="Picture 6"/>
             <wp:cNvGraphicFramePr>
               <a:graphicFrameLocks xmlns:a="http://schemas.openxmlformats.org/drawingml/2006/main" noChangeAspect="1"/>
@@ -55,7 +55,7 @@
                   <pic:spPr>
                     <a:xfrm>
                       <a:off x="0" y="0"/>
-                      <a:ext cx="2860378" cy="1502095"/>
+                      <a:ext cx="2865829" cy="2132950"/>
                     </a:xfrm>
                     <a:prstGeom prst="rect">
                       <a:avLst/>
@@ -134,23 +134,7 @@
           <w:sz w:val="20"/>
           <w:szCs w:val="20"/>
         </w:rPr>
-        <w:t xml:space="preserve">Emmanuel </w:t>
-      </w:r>
-      <w:proofErr w:type="spellStart"/>
-      <w:r>
-        <w:rPr>
-          <w:sz w:val="20"/>
-          <w:szCs w:val="20"/>
-        </w:rPr>
-        <w:t>Ongera</w:t>
-      </w:r>
-      <w:proofErr w:type="spellEnd"/>
-      <w:r>
-        <w:rPr>
-          <w:sz w:val="20"/>
-          <w:szCs w:val="20"/>
-        </w:rPr>
-        <w:t xml:space="preserve"> Mose</w:t>
+        <w:t>Emmanuel Ongera Mose</w:t>
       </w:r>
       <w:r>
         <w:rPr>
@@ -200,6 +184,8 @@
         </w:rPr>
         <w:t>8146250</w:t>
       </w:r>
+      <w:bookmarkStart w:id="0" w:name="_GoBack"/>
+      <w:bookmarkEnd w:id="0"/>
     </w:p>
     <w:p>
       <w:pPr>
@@ -267,7 +253,6 @@
         </w:rPr>
         <w:t xml:space="preserve"> </w:t>
       </w:r>
-      <w:proofErr w:type="spellStart"/>
       <w:r>
         <w:rPr>
           <w:b/>
@@ -277,7 +262,6 @@
         </w:rPr>
         <w:t>Github</w:t>
       </w:r>
-      <w:proofErr w:type="spellEnd"/>
       <w:r>
         <w:rPr>
           <w:sz w:val="20"/>
@@ -293,6 +277,9 @@
         </w:rPr>
         <w:t xml:space="preserve"> </w:t>
       </w:r>
+      <w:r>
+        <w:t>https://github.com/EmmanuelMose</w:t>
+      </w:r>
     </w:p>
     <w:p>
       <w:pPr>
@@ -307,32 +294,30 @@
           <w:sz w:val="20"/>
           <w:szCs w:val="20"/>
         </w:rPr>
-        <w:t xml:space="preserve">  </w:t>
-      </w:r>
-      <w:r>
-        <w:rPr>
-          <w:b/>
-          <w:bCs/>
-          <w:sz w:val="20"/>
-          <w:szCs w:val="20"/>
-        </w:rPr>
-        <w:t>Portfoli</w:t>
-      </w:r>
-      <w:r>
-        <w:rPr>
-          <w:b/>
-          <w:bCs/>
-          <w:sz w:val="20"/>
-          <w:szCs w:val="20"/>
-        </w:rPr>
-        <w:t>o</w:t>
-      </w:r>
-      <w:r>
-        <w:rPr>
-          <w:sz w:val="20"/>
-          <w:szCs w:val="20"/>
-        </w:rPr>
-        <w:t xml:space="preserve">: </w:t>
+        <w:t xml:space="preserve"> </w:t>
+      </w:r>
+      <w:r>
+        <w:rPr>
+          <w:sz w:val="20"/>
+          <w:szCs w:val="20"/>
+        </w:rPr>
+        <w:t xml:space="preserve"> </w:t>
+      </w:r>
+      <w:r>
+        <w:rPr>
+          <w:b/>
+          <w:bCs/>
+          <w:sz w:val="20"/>
+          <w:szCs w:val="20"/>
+        </w:rPr>
+        <w:t>Occupation</w:t>
+      </w:r>
+      <w:r>
+        <w:rPr>
+          <w:sz w:val="20"/>
+          <w:szCs w:val="20"/>
+        </w:rPr>
+        <w:t xml:space="preserve">: Computer Science student at Masinde Muliro University of Science and Technology. </w:t>
       </w:r>
     </w:p>
     <w:p>
@@ -345,130 +330,59 @@
       </w:pPr>
       <w:r>
         <w:rPr>
-          <w:sz w:val="20"/>
-          <w:szCs w:val="20"/>
-        </w:rPr>
-        <w:t xml:space="preserve"> </w:t>
-      </w:r>
-      <w:r>
-        <w:rPr>
-          <w:sz w:val="20"/>
-          <w:szCs w:val="20"/>
-        </w:rPr>
-        <w:t xml:space="preserve"> </w:t>
-      </w:r>
-      <w:r>
-        <w:rPr>
-          <w:b/>
-          <w:bCs/>
-          <w:sz w:val="20"/>
-          <w:szCs w:val="20"/>
-        </w:rPr>
-        <w:t>Occupation</w:t>
-      </w:r>
-      <w:r>
-        <w:rPr>
-          <w:sz w:val="20"/>
-          <w:szCs w:val="20"/>
-        </w:rPr>
-        <w:t xml:space="preserve">: Computer Science student at Masinde </w:t>
-      </w:r>
-      <w:proofErr w:type="spellStart"/>
-      <w:r>
-        <w:rPr>
-          <w:sz w:val="20"/>
-          <w:szCs w:val="20"/>
-        </w:rPr>
-        <w:t>Muliro</w:t>
-      </w:r>
-      <w:proofErr w:type="spellEnd"/>
-      <w:r>
-        <w:rPr>
-          <w:sz w:val="20"/>
-          <w:szCs w:val="20"/>
-        </w:rPr>
-        <w:t xml:space="preserve"> University of Science and Technology. </w:t>
+          <w:b/>
+          <w:bCs/>
+          <w:sz w:val="20"/>
+          <w:szCs w:val="20"/>
+        </w:rPr>
+        <w:t>Nickname</w:t>
+      </w:r>
+      <w:r>
+        <w:rPr>
+          <w:sz w:val="20"/>
+          <w:szCs w:val="20"/>
+        </w:rPr>
+        <w:t>: Emmanuel Guru</w:t>
       </w:r>
     </w:p>
     <w:p>
       <w:pPr>
         <w:spacing w:line="240" w:lineRule="auto"/>
         <w:rPr>
-          <w:sz w:val="20"/>
-          <w:szCs w:val="20"/>
-        </w:rPr>
-      </w:pPr>
-      <w:r>
-        <w:rPr>
-          <w:b/>
-          <w:bCs/>
-          <w:sz w:val="20"/>
-          <w:szCs w:val="20"/>
-        </w:rPr>
-        <w:t>Nickname</w:t>
-      </w:r>
-      <w:r>
-        <w:rPr>
-          <w:sz w:val="20"/>
-          <w:szCs w:val="20"/>
-        </w:rPr>
-        <w:t>: Emmanuel Guru</w:t>
+          <w:b/>
+          <w:bCs/>
+          <w:color w:val="385623" w:themeColor="accent6" w:themeShade="80"/>
+          <w:sz w:val="20"/>
+          <w:szCs w:val="20"/>
+          <w:u w:val="single"/>
+        </w:rPr>
+      </w:pPr>
+      <w:r>
+        <w:rPr>
+          <w:b/>
+          <w:bCs/>
+          <w:color w:val="385623" w:themeColor="accent6" w:themeShade="80"/>
+          <w:sz w:val="20"/>
+          <w:szCs w:val="20"/>
+          <w:u w:val="single"/>
+        </w:rPr>
+        <w:t xml:space="preserve">Summary Statement </w:t>
       </w:r>
     </w:p>
     <w:p>
       <w:pPr>
         <w:spacing w:line="240" w:lineRule="auto"/>
         <w:rPr>
-          <w:b/>
-          <w:bCs/>
-          <w:color w:val="385623" w:themeColor="accent6" w:themeShade="80"/>
-          <w:sz w:val="20"/>
-          <w:szCs w:val="20"/>
-          <w:u w:val="single"/>
-        </w:rPr>
-      </w:pPr>
-      <w:r>
-        <w:rPr>
-          <w:b/>
-          <w:bCs/>
-          <w:color w:val="385623" w:themeColor="accent6" w:themeShade="80"/>
-          <w:sz w:val="20"/>
-          <w:szCs w:val="20"/>
-          <w:u w:val="single"/>
-        </w:rPr>
-        <w:t xml:space="preserve">Summary Statement </w:t>
-      </w:r>
-    </w:p>
-    <w:p>
-      <w:pPr>
-        <w:spacing w:line="240" w:lineRule="auto"/>
-        <w:rPr>
-          <w:sz w:val="20"/>
-          <w:szCs w:val="20"/>
-        </w:rPr>
-      </w:pPr>
-      <w:r>
-        <w:rPr>
-          <w:sz w:val="20"/>
-          <w:szCs w:val="20"/>
-        </w:rPr>
-        <w:t xml:space="preserve">A self-motivated, passionate and responsible undergraduate student at Masinde </w:t>
-      </w:r>
-      <w:proofErr w:type="spellStart"/>
-      <w:r>
-        <w:rPr>
-          <w:sz w:val="20"/>
-          <w:szCs w:val="20"/>
-        </w:rPr>
-        <w:t>Muliro</w:t>
-      </w:r>
-      <w:proofErr w:type="spellEnd"/>
-      <w:r>
-        <w:rPr>
-          <w:sz w:val="20"/>
-          <w:szCs w:val="20"/>
-        </w:rPr>
-        <w:t xml:space="preserve"> University of Science and Technology. I love computer programming, networking </w:t>
+          <w:sz w:val="20"/>
+          <w:szCs w:val="20"/>
+        </w:rPr>
+      </w:pPr>
+      <w:r>
+        <w:rPr>
+          <w:sz w:val="20"/>
+          <w:szCs w:val="20"/>
+        </w:rPr>
+        <w:t xml:space="preserve">A self-motivated, passionate and responsible undergraduate student at Masinde Muliro University of Science and Technology. I love computer programming, networking </w:t>
       </w:r>
       <w:r>
         <w:rPr>
@@ -489,30 +403,14 @@
           <w:sz w:val="20"/>
           <w:szCs w:val="20"/>
         </w:rPr>
-        <w:t xml:space="preserve">machine learning </w:t>
-      </w:r>
-      <w:proofErr w:type="gramStart"/>
-      <w:r>
-        <w:rPr>
-          <w:sz w:val="20"/>
-          <w:szCs w:val="20"/>
-        </w:rPr>
-        <w:t xml:space="preserve">and </w:t>
-      </w:r>
-      <w:r>
-        <w:rPr>
-          <w:sz w:val="20"/>
-          <w:szCs w:val="20"/>
-        </w:rPr>
-        <w:t xml:space="preserve"> artificial</w:t>
-      </w:r>
-      <w:proofErr w:type="gramEnd"/>
-      <w:r>
-        <w:rPr>
-          <w:sz w:val="20"/>
-          <w:szCs w:val="20"/>
-        </w:rPr>
-        <w:t xml:space="preserve"> intelligence. </w:t>
+        <w:t xml:space="preserve">machine learning and </w:t>
+      </w:r>
+      <w:r>
+        <w:rPr>
+          <w:sz w:val="20"/>
+          <w:szCs w:val="20"/>
+        </w:rPr>
+        <w:t xml:space="preserve"> artificial intelligence. </w:t>
       </w:r>
     </w:p>
     <w:p>
@@ -638,23 +536,7 @@
           <w:sz w:val="20"/>
           <w:szCs w:val="20"/>
         </w:rPr>
-        <w:t xml:space="preserve">tudent at Masinde </w:t>
-      </w:r>
-      <w:proofErr w:type="spellStart"/>
-      <w:r>
-        <w:rPr>
-          <w:sz w:val="20"/>
-          <w:szCs w:val="20"/>
-        </w:rPr>
-        <w:t>Muliro</w:t>
-      </w:r>
-      <w:proofErr w:type="spellEnd"/>
-      <w:r>
-        <w:rPr>
-          <w:sz w:val="20"/>
-          <w:szCs w:val="20"/>
-        </w:rPr>
-        <w:t xml:space="preserve"> University of Science and Technology.</w:t>
+        <w:t>tudent at Masinde Muliro University of Science and Technology.</w:t>
       </w:r>
     </w:p>
     <w:p>
@@ -747,23 +629,7 @@
           <w:sz w:val="20"/>
           <w:szCs w:val="20"/>
         </w:rPr>
-        <w:t xml:space="preserve">Kenya Certificate of Secondary </w:t>
-      </w:r>
-      <w:proofErr w:type="gramStart"/>
-      <w:r>
-        <w:rPr>
-          <w:sz w:val="20"/>
-          <w:szCs w:val="20"/>
-        </w:rPr>
-        <w:t>Education( KCSE</w:t>
-      </w:r>
-      <w:proofErr w:type="gramEnd"/>
-      <w:r>
-        <w:rPr>
-          <w:sz w:val="20"/>
-          <w:szCs w:val="20"/>
-        </w:rPr>
-        <w:t>).</w:t>
+        <w:t>Kenya Certificate of Secondary Education( KCSE).</w:t>
       </w:r>
     </w:p>
     <w:p>
@@ -788,33 +654,13 @@
         </w:rPr>
         <w:t xml:space="preserve">     </w:t>
       </w:r>
-      <w:proofErr w:type="spellStart"/>
-      <w:r>
-        <w:rPr>
-          <w:sz w:val="20"/>
-          <w:szCs w:val="20"/>
-        </w:rPr>
-        <w:t>Ringa</w:t>
-      </w:r>
-      <w:proofErr w:type="spellEnd"/>
-      <w:r>
-        <w:rPr>
-          <w:sz w:val="20"/>
-          <w:szCs w:val="20"/>
-        </w:rPr>
-        <w:t xml:space="preserve"> boys High </w:t>
-      </w:r>
-      <w:proofErr w:type="spellStart"/>
-      <w:proofErr w:type="gramStart"/>
-      <w:r>
-        <w:rPr>
-          <w:sz w:val="20"/>
-          <w:szCs w:val="20"/>
-        </w:rPr>
-        <w:t>School,Homabay</w:t>
-      </w:r>
-      <w:proofErr w:type="spellEnd"/>
-      <w:proofErr w:type="gramEnd"/>
+      <w:r>
+        <w:rPr>
+          <w:sz w:val="20"/>
+          <w:szCs w:val="20"/>
+        </w:rPr>
+        <w:t>Ringa boys High School,Homabay</w:t>
+      </w:r>
     </w:p>
     <w:p>
       <w:pPr>
@@ -950,33 +796,13 @@
         </w:rPr>
         <w:t xml:space="preserve"> </w:t>
       </w:r>
-      <w:proofErr w:type="spellStart"/>
-      <w:r>
-        <w:rPr>
-          <w:sz w:val="20"/>
-          <w:szCs w:val="20"/>
-        </w:rPr>
-        <w:t>Kiango</w:t>
-      </w:r>
-      <w:proofErr w:type="spellEnd"/>
-      <w:r>
-        <w:rPr>
-          <w:sz w:val="20"/>
-          <w:szCs w:val="20"/>
-        </w:rPr>
-        <w:t xml:space="preserve"> Primary </w:t>
-      </w:r>
-      <w:proofErr w:type="spellStart"/>
-      <w:proofErr w:type="gramStart"/>
-      <w:r>
-        <w:rPr>
-          <w:sz w:val="20"/>
-          <w:szCs w:val="20"/>
-        </w:rPr>
-        <w:t>School,Kisii</w:t>
-      </w:r>
-      <w:proofErr w:type="spellEnd"/>
-      <w:proofErr w:type="gramEnd"/>
+      <w:r>
+        <w:rPr>
+          <w:sz w:val="20"/>
+          <w:szCs w:val="20"/>
+        </w:rPr>
+        <w:t>Kiango Primary School,Kisii</w:t>
+      </w:r>
       <w:r>
         <w:rPr>
           <w:sz w:val="20"/>
@@ -1070,23 +896,7 @@
           <w:sz w:val="20"/>
           <w:szCs w:val="20"/>
         </w:rPr>
-        <w:t xml:space="preserve">Mobile </w:t>
-      </w:r>
-      <w:proofErr w:type="gramStart"/>
-      <w:r>
-        <w:rPr>
-          <w:sz w:val="20"/>
-          <w:szCs w:val="20"/>
-        </w:rPr>
-        <w:t>Development(</w:t>
-      </w:r>
-      <w:proofErr w:type="gramEnd"/>
-      <w:r>
-        <w:rPr>
-          <w:sz w:val="20"/>
-          <w:szCs w:val="20"/>
-        </w:rPr>
-        <w:t xml:space="preserve">Android App Development using java). </w:t>
+        <w:t xml:space="preserve">Mobile Development(Android App Development using java). </w:t>
       </w:r>
     </w:p>
     <w:p>
@@ -1106,23 +916,7 @@
           <w:sz w:val="20"/>
           <w:szCs w:val="20"/>
         </w:rPr>
-        <w:t>Desktop Development using java(</w:t>
-      </w:r>
-      <w:proofErr w:type="spellStart"/>
-      <w:r>
-        <w:rPr>
-          <w:sz w:val="20"/>
-          <w:szCs w:val="20"/>
-        </w:rPr>
-        <w:t>javaFX</w:t>
-      </w:r>
-      <w:proofErr w:type="spellEnd"/>
-      <w:r>
-        <w:rPr>
-          <w:sz w:val="20"/>
-          <w:szCs w:val="20"/>
-        </w:rPr>
-        <w:t>).</w:t>
+        <w:t>Desktop Development using java(javaFX).</w:t>
       </w:r>
     </w:p>
     <w:p>
@@ -1142,23 +936,7 @@
           <w:sz w:val="20"/>
           <w:szCs w:val="20"/>
         </w:rPr>
-        <w:t xml:space="preserve">GUI design using </w:t>
-      </w:r>
-      <w:proofErr w:type="spellStart"/>
-      <w:r>
-        <w:rPr>
-          <w:sz w:val="20"/>
-          <w:szCs w:val="20"/>
-        </w:rPr>
-        <w:t>Tkinter</w:t>
-      </w:r>
-      <w:proofErr w:type="spellEnd"/>
-      <w:r>
-        <w:rPr>
-          <w:sz w:val="20"/>
-          <w:szCs w:val="20"/>
-        </w:rPr>
-        <w:t xml:space="preserve"> in python</w:t>
+        <w:t>GUI design using Tkinter in python</w:t>
       </w:r>
     </w:p>
     <w:p>
@@ -1198,30 +976,14 @@
           <w:sz w:val="20"/>
           <w:szCs w:val="20"/>
         </w:rPr>
-        <w:t>Front-end web design using HTML5, CSS</w:t>
-      </w:r>
-      <w:proofErr w:type="gramStart"/>
-      <w:r>
-        <w:rPr>
-          <w:sz w:val="20"/>
-          <w:szCs w:val="20"/>
-        </w:rPr>
-        <w:t>3</w:t>
-      </w:r>
-      <w:r>
-        <w:rPr>
-          <w:sz w:val="20"/>
-          <w:szCs w:val="20"/>
-        </w:rPr>
-        <w:t>,ReactJs</w:t>
-      </w:r>
-      <w:proofErr w:type="gramEnd"/>
-      <w:r>
-        <w:rPr>
-          <w:sz w:val="20"/>
-          <w:szCs w:val="20"/>
-        </w:rPr>
-        <w:t>,AngularJs</w:t>
+        <w:t>Front-end web design using HTML5, CSS3</w:t>
+      </w:r>
+      <w:r>
+        <w:rPr>
+          <w:sz w:val="20"/>
+          <w:szCs w:val="20"/>
+        </w:rPr>
+        <w:t>,ReactJs,AngularJs</w:t>
       </w:r>
       <w:r>
         <w:rPr>
@@ -1359,23 +1121,7 @@
           <w:sz w:val="20"/>
           <w:szCs w:val="20"/>
         </w:rPr>
-        <w:t xml:space="preserve">computer games in python which are in my </w:t>
-      </w:r>
-      <w:proofErr w:type="spellStart"/>
-      <w:r>
-        <w:rPr>
-          <w:sz w:val="20"/>
-          <w:szCs w:val="20"/>
-        </w:rPr>
-        <w:t>github</w:t>
-      </w:r>
-      <w:proofErr w:type="spellEnd"/>
-      <w:r>
-        <w:rPr>
-          <w:sz w:val="20"/>
-          <w:szCs w:val="20"/>
-        </w:rPr>
-        <w:t>.</w:t>
+        <w:t>computer games in python which are in my github.</w:t>
       </w:r>
     </w:p>
     <w:p>
@@ -1390,7 +1136,6 @@
           <w:szCs w:val="20"/>
         </w:rPr>
       </w:pPr>
-      <w:proofErr w:type="gramStart"/>
       <w:r>
         <w:rPr>
           <w:sz w:val="20"/>
@@ -1403,15 +1148,7 @@
           <w:sz w:val="20"/>
           <w:szCs w:val="20"/>
         </w:rPr>
-        <w:t>an</w:t>
-      </w:r>
-      <w:proofErr w:type="gramEnd"/>
-      <w:r>
-        <w:rPr>
-          <w:sz w:val="20"/>
-          <w:szCs w:val="20"/>
-        </w:rPr>
-        <w:t xml:space="preserve"> online voting system using python and SQL DBMS.</w:t>
+        <w:t>an online voting system using python and SQL DBMS.</w:t>
       </w:r>
     </w:p>
     <w:p>
@@ -1431,41 +1168,7 @@
           <w:sz w:val="20"/>
           <w:szCs w:val="20"/>
         </w:rPr>
-        <w:t xml:space="preserve">Created </w:t>
-      </w:r>
-      <w:proofErr w:type="spellStart"/>
-      <w:r>
-        <w:rPr>
-          <w:sz w:val="20"/>
-          <w:szCs w:val="20"/>
-        </w:rPr>
-        <w:t>arious</w:t>
-      </w:r>
-      <w:proofErr w:type="spellEnd"/>
-      <w:r>
-        <w:rPr>
-          <w:sz w:val="20"/>
-          <w:szCs w:val="20"/>
-        </w:rPr>
-        <w:t xml:space="preserve"> software systems like </w:t>
-      </w:r>
-      <w:proofErr w:type="spellStart"/>
-      <w:proofErr w:type="gramStart"/>
-      <w:r>
-        <w:rPr>
-          <w:sz w:val="20"/>
-          <w:szCs w:val="20"/>
-        </w:rPr>
-        <w:t>hospital,inventory</w:t>
-      </w:r>
-      <w:proofErr w:type="spellEnd"/>
-      <w:proofErr w:type="gramEnd"/>
-      <w:r>
-        <w:rPr>
-          <w:sz w:val="20"/>
-          <w:szCs w:val="20"/>
-        </w:rPr>
-        <w:t xml:space="preserve"> and school management systems.</w:t>
+        <w:t>Created arious software systems like hospital,inventory and school management systems.</w:t>
       </w:r>
     </w:p>
     <w:p>
@@ -1592,23 +1295,7 @@
           <w:sz w:val="20"/>
           <w:szCs w:val="20"/>
         </w:rPr>
-        <w:t xml:space="preserve">Took part and completed the industrial training program offered at Masinde </w:t>
-      </w:r>
-      <w:proofErr w:type="spellStart"/>
-      <w:r>
-        <w:rPr>
-          <w:sz w:val="20"/>
-          <w:szCs w:val="20"/>
-        </w:rPr>
-        <w:t>Muliro</w:t>
-      </w:r>
-      <w:proofErr w:type="spellEnd"/>
-      <w:r>
-        <w:rPr>
-          <w:sz w:val="20"/>
-          <w:szCs w:val="20"/>
-        </w:rPr>
-        <w:t xml:space="preserve"> University of Science and Technology. </w:t>
+        <w:t xml:space="preserve">Took part and completed the industrial training program offered at Masinde Muliro University of Science and Technology. </w:t>
       </w:r>
     </w:p>
     <w:p>
@@ -1699,23 +1386,7 @@
           <w:sz w:val="20"/>
           <w:szCs w:val="20"/>
         </w:rPr>
-        <w:t xml:space="preserve">I enjoy works of art such </w:t>
-      </w:r>
-      <w:proofErr w:type="gramStart"/>
-      <w:r>
-        <w:rPr>
-          <w:sz w:val="20"/>
-          <w:szCs w:val="20"/>
-        </w:rPr>
-        <w:t>as  designing</w:t>
-      </w:r>
-      <w:proofErr w:type="gramEnd"/>
-      <w:r>
-        <w:rPr>
-          <w:sz w:val="20"/>
-          <w:szCs w:val="20"/>
-        </w:rPr>
-        <w:t>, experimenting and implementing new ways of doing things.</w:t>
+        <w:t>I enjoy works of art such as  designing, experimenting and implementing new ways of doing things.</w:t>
       </w:r>
     </w:p>
     <w:p>
@@ -1871,23 +1542,7 @@
           <w:sz w:val="20"/>
           <w:szCs w:val="20"/>
         </w:rPr>
-        <w:t xml:space="preserve">: Dr. Raphael </w:t>
-      </w:r>
-      <w:proofErr w:type="spellStart"/>
-      <w:r>
-        <w:rPr>
-          <w:sz w:val="20"/>
-          <w:szCs w:val="20"/>
-        </w:rPr>
-        <w:t>Angulu</w:t>
-      </w:r>
-      <w:proofErr w:type="spellEnd"/>
-      <w:r>
-        <w:rPr>
-          <w:sz w:val="20"/>
-          <w:szCs w:val="20"/>
-        </w:rPr>
-        <w:t xml:space="preserve"> </w:t>
+        <w:t xml:space="preserve">: Dr. Raphael Angulu </w:t>
       </w:r>
     </w:p>
     <w:p>
@@ -2043,15 +1698,43 @@
           <w:sz w:val="20"/>
           <w:szCs w:val="20"/>
         </w:rPr>
-        <w:t xml:space="preserve">: Lecturer and Head of Department, Department of Information </w:t>
-      </w:r>
-      <w:proofErr w:type="gramStart"/>
-      <w:r>
-        <w:rPr>
-          <w:sz w:val="20"/>
-          <w:szCs w:val="20"/>
-        </w:rPr>
-        <w:t xml:space="preserve">Technology, </w:t>
+        <w:t xml:space="preserve">: Lecturer and Head of Department, Department of Information Technology, </w:t>
+      </w:r>
+      <w:r>
+        <w:rPr>
+          <w:sz w:val="20"/>
+          <w:szCs w:val="20"/>
+        </w:rPr>
+        <w:t xml:space="preserve">      </w:t>
+      </w:r>
+      <w:r>
+        <w:rPr>
+          <w:sz w:val="20"/>
+          <w:szCs w:val="20"/>
+        </w:rPr>
+        <w:t xml:space="preserve">school of Computing and Informatics. </w:t>
+      </w:r>
+    </w:p>
+    <w:p>
+      <w:pPr>
+        <w:rPr>
+          <w:sz w:val="20"/>
+          <w:szCs w:val="20"/>
+        </w:rPr>
+      </w:pPr>
+      <w:r>
+        <w:rPr>
+          <w:sz w:val="20"/>
+          <w:szCs w:val="20"/>
+        </w:rPr>
+        <w:t xml:space="preserve"> </w:t>
+      </w:r>
+      <w:r>
+        <w:rPr>
+          <w:sz w:val="20"/>
+          <w:szCs w:val="20"/>
+        </w:rPr>
+        <w:t>2.</w:t>
       </w:r>
       <w:r>
         <w:rPr>
@@ -2060,9 +1743,96 @@
         </w:rPr>
         <w:t xml:space="preserve">  </w:t>
       </w:r>
-      <w:proofErr w:type="gramEnd"/>
-      <w:r>
-        <w:rPr>
+    </w:p>
+    <w:p>
+      <w:pPr>
+        <w:rPr>
+          <w:sz w:val="20"/>
+          <w:szCs w:val="20"/>
+        </w:rPr>
+      </w:pPr>
+      <w:r>
+        <w:rPr>
+          <w:sz w:val="20"/>
+          <w:szCs w:val="20"/>
+        </w:rPr>
+        <w:t xml:space="preserve">  </w:t>
+      </w:r>
+      <w:r>
+        <w:rPr>
+          <w:sz w:val="20"/>
+          <w:szCs w:val="20"/>
+        </w:rPr>
+        <w:t xml:space="preserve"> </w:t>
+      </w:r>
+      <w:r>
+        <w:rPr>
+          <w:b/>
+          <w:bCs/>
+          <w:sz w:val="20"/>
+          <w:szCs w:val="20"/>
+        </w:rPr>
+        <w:t>Name</w:t>
+      </w:r>
+      <w:r>
+        <w:rPr>
+          <w:sz w:val="20"/>
+          <w:szCs w:val="20"/>
+        </w:rPr>
+        <w:t>: George Mageto</w:t>
+      </w:r>
+      <w:r>
+        <w:rPr>
+          <w:sz w:val="20"/>
+          <w:szCs w:val="20"/>
+        </w:rPr>
+        <w:t>.</w:t>
+      </w:r>
+    </w:p>
+    <w:p>
+      <w:pPr>
+        <w:rPr>
+          <w:sz w:val="20"/>
+          <w:szCs w:val="20"/>
+        </w:rPr>
+      </w:pPr>
+      <w:r>
+        <w:rPr>
+          <w:b/>
+          <w:bCs/>
+          <w:sz w:val="20"/>
+          <w:szCs w:val="20"/>
+        </w:rPr>
+        <w:t xml:space="preserve">   </w:t>
+      </w:r>
+      <w:r>
+        <w:rPr>
+          <w:b/>
+          <w:bCs/>
+          <w:sz w:val="20"/>
+          <w:szCs w:val="20"/>
+        </w:rPr>
+        <w:t xml:space="preserve"> Phone</w:t>
+      </w:r>
+      <w:r>
+        <w:rPr>
+          <w:sz w:val="20"/>
+          <w:szCs w:val="20"/>
+        </w:rPr>
+        <w:t>: 0724225552</w:t>
+      </w:r>
+    </w:p>
+    <w:p>
+      <w:pPr>
+        <w:rPr>
+          <w:sz w:val="20"/>
+          <w:szCs w:val="20"/>
+        </w:rPr>
+      </w:pPr>
+      <w:r>
+        <w:rPr>
+          <w:b/>
+          <w:bCs/>
           <w:sz w:val="20"/>
           <w:szCs w:val="20"/>
         </w:rPr>
@@ -2070,179 +1840,6 @@
       </w:r>
       <w:r>
         <w:rPr>
-          <w:sz w:val="20"/>
-          <w:szCs w:val="20"/>
-        </w:rPr>
-        <w:t xml:space="preserve">school of Computing and Informatics. </w:t>
-      </w:r>
-    </w:p>
-    <w:p>
-      <w:pPr>
-        <w:rPr>
-          <w:sz w:val="20"/>
-          <w:szCs w:val="20"/>
-        </w:rPr>
-      </w:pPr>
-      <w:r>
-        <w:rPr>
-          <w:sz w:val="20"/>
-          <w:szCs w:val="20"/>
-        </w:rPr>
-        <w:t xml:space="preserve"> </w:t>
-      </w:r>
-      <w:r>
-        <w:rPr>
-          <w:sz w:val="20"/>
-          <w:szCs w:val="20"/>
-        </w:rPr>
-        <w:t>2.</w:t>
-      </w:r>
-      <w:r>
-        <w:rPr>
-          <w:sz w:val="20"/>
-          <w:szCs w:val="20"/>
-        </w:rPr>
-        <w:t xml:space="preserve">  </w:t>
-      </w:r>
-    </w:p>
-    <w:p>
-      <w:pPr>
-        <w:rPr>
-          <w:sz w:val="20"/>
-          <w:szCs w:val="20"/>
-        </w:rPr>
-      </w:pPr>
-      <w:r>
-        <w:rPr>
-          <w:sz w:val="20"/>
-          <w:szCs w:val="20"/>
-        </w:rPr>
-        <w:t xml:space="preserve">  </w:t>
-      </w:r>
-      <w:r>
-        <w:rPr>
-          <w:sz w:val="20"/>
-          <w:szCs w:val="20"/>
-        </w:rPr>
-        <w:t xml:space="preserve"> </w:t>
-      </w:r>
-      <w:r>
-        <w:rPr>
-          <w:b/>
-          <w:bCs/>
-          <w:sz w:val="20"/>
-          <w:szCs w:val="20"/>
-        </w:rPr>
-        <w:t>Name</w:t>
-      </w:r>
-      <w:r>
-        <w:rPr>
-          <w:sz w:val="20"/>
-          <w:szCs w:val="20"/>
-        </w:rPr>
-        <w:t xml:space="preserve">: Dr. Jasper </w:t>
-      </w:r>
-      <w:proofErr w:type="spellStart"/>
-      <w:r>
-        <w:rPr>
-          <w:sz w:val="20"/>
-          <w:szCs w:val="20"/>
-        </w:rPr>
-        <w:t>Ondulo</w:t>
-      </w:r>
-      <w:proofErr w:type="spellEnd"/>
-      <w:r>
-        <w:rPr>
-          <w:sz w:val="20"/>
-          <w:szCs w:val="20"/>
-        </w:rPr>
-        <w:t>.</w:t>
-      </w:r>
-    </w:p>
-    <w:p>
-      <w:pPr>
-        <w:rPr>
-          <w:sz w:val="20"/>
-          <w:szCs w:val="20"/>
-        </w:rPr>
-      </w:pPr>
-      <w:r>
-        <w:rPr>
-          <w:b/>
-          <w:bCs/>
-          <w:sz w:val="20"/>
-          <w:szCs w:val="20"/>
-        </w:rPr>
-        <w:t xml:space="preserve">   </w:t>
-      </w:r>
-      <w:r>
-        <w:rPr>
-          <w:b/>
-          <w:bCs/>
-          <w:sz w:val="20"/>
-          <w:szCs w:val="20"/>
-        </w:rPr>
-        <w:t xml:space="preserve"> Phone</w:t>
-      </w:r>
-      <w:r>
-        <w:rPr>
-          <w:sz w:val="20"/>
-          <w:szCs w:val="20"/>
-        </w:rPr>
-        <w:t>: 0727716382</w:t>
-      </w:r>
-    </w:p>
-    <w:p>
-      <w:pPr>
-        <w:rPr>
-          <w:b/>
-          <w:bCs/>
-          <w:sz w:val="20"/>
-          <w:szCs w:val="20"/>
-        </w:rPr>
-      </w:pPr>
-      <w:r>
-        <w:rPr>
-          <w:sz w:val="20"/>
-          <w:szCs w:val="20"/>
-        </w:rPr>
-        <w:t xml:space="preserve">   </w:t>
-      </w:r>
-      <w:r>
-        <w:rPr>
-          <w:sz w:val="20"/>
-          <w:szCs w:val="20"/>
-        </w:rPr>
-        <w:t xml:space="preserve"> </w:t>
-      </w:r>
-      <w:r>
-        <w:rPr>
-          <w:b/>
-          <w:bCs/>
-          <w:sz w:val="20"/>
-          <w:szCs w:val="20"/>
-        </w:rPr>
-        <w:t>Email</w:t>
-      </w:r>
-    </w:p>
-    <w:p>
-      <w:pPr>
-        <w:rPr>
-          <w:sz w:val="20"/>
-          <w:szCs w:val="20"/>
-        </w:rPr>
-      </w:pPr>
-      <w:r>
-        <w:rPr>
-          <w:b/>
-          <w:bCs/>
-          <w:sz w:val="20"/>
-          <w:szCs w:val="20"/>
-        </w:rPr>
-        <w:t xml:space="preserve">    </w:t>
-      </w:r>
-      <w:r>
-        <w:rPr>
           <w:b/>
           <w:bCs/>
           <w:sz w:val="20"/>
@@ -2255,21 +1852,7 @@
           <w:sz w:val="20"/>
           <w:szCs w:val="20"/>
         </w:rPr>
-        <w:t>: Lecturer and Head of Department, Department of Computer Science, school of Computing and Info</w:t>
-      </w:r>
-      <w:r>
-        <w:rPr>
-          <w:sz w:val="20"/>
-          <w:szCs w:val="20"/>
-        </w:rPr>
-        <w:t>r</w:t>
-      </w:r>
-      <w:r>
-        <w:rPr>
-          <w:sz w:val="20"/>
-          <w:szCs w:val="20"/>
-        </w:rPr>
-        <w:t>matics</w:t>
+        <w:t>: Lecturer Dedan Kimathi University</w:t>
       </w:r>
       <w:r>
         <w:rPr>
@@ -2291,7 +1874,7 @@
 </file>
 
 <file path=word/endnotes.xml><?xml version="1.0" encoding="utf-8"?>
-<w:endnotes xmlns:wpc="http://schemas.microsoft.com/office/word/2010/wordprocessingCanvas" xmlns:cx="http://schemas.microsoft.com/office/drawing/2014/chartex" xmlns:cx1="http://schemas.microsoft.com/office/drawing/2015/9/8/chartex" xmlns:cx2="http://schemas.microsoft.com/office/drawing/2015/10/21/chartex" xmlns:cx3="http://schemas.microsoft.com/office/drawing/2016/5/9/chartex" xmlns:cx4="http://schemas.microsoft.com/office/drawing/2016/5/10/chartex" xmlns:cx5="http://schemas.microsoft.com/office/drawing/2016/5/11/chartex" xmlns:cx6="http://schemas.microsoft.com/office/drawing/2016/5/12/chartex" xmlns:cx7="http://schemas.microsoft.com/office/drawing/2016/5/13/chartex" xmlns:cx8="http://schemas.microsoft.com/office/drawing/2016/5/14/chartex" xmlns:mc="http://schemas.openxmlformats.org/markup-compatibility/2006" xmlns:aink="http://schemas.microsoft.com/office/drawing/2016/ink" xmlns:am3d="http://schemas.microsoft.com/office/drawing/2017/model3d" xmlns:o="urn:schemas-microsoft-com:office:office" xmlns:oel="http://schemas.microsoft.com/office/2019/extlst" xmlns:r="http://schemas.openxmlformats.org/officeDocument/2006/relationships" xmlns:m="http://schemas.openxmlformats.org/officeDocument/2006/math" xmlns:v="urn:schemas-microsoft-com:vml" xmlns:wp14="http://schemas.microsoft.com/office/word/2010/wordprocessingDrawing" xmlns:wp="http://schemas.openxmlformats.org/drawingml/2006/wordprocessingDrawing" xmlns:w10="urn:schemas-microsoft-com:office:word" xmlns:w="http://schemas.openxmlformats.org/wordprocessingml/2006/main" xmlns:w14="http://schemas.microsoft.com/office/word/2010/wordml" xmlns:w15="http://schemas.microsoft.com/office/word/2012/wordml" xmlns:w16cex="http://schemas.microsoft.com/office/word/2018/wordml/cex" xmlns:w16cid="http://schemas.microsoft.com/office/word/2016/wordml/cid" xmlns:w16="http://schemas.microsoft.com/office/word/2018/wordml" xmlns:w16du="http://schemas.microsoft.com/office/word/2023/wordml/word16du" xmlns:w16sdtdh="http://schemas.microsoft.com/office/word/2020/wordml/sdtdatahash" xmlns:w16sdtfl="http://schemas.microsoft.com/office/word/2024/wordml/sdtformatlock" xmlns:w16se="http://schemas.microsoft.com/office/word/2015/wordml/symex" xmlns:wpg="http://schemas.microsoft.com/office/word/2010/wordprocessingGroup" xmlns:wpi="http://schemas.microsoft.com/office/word/2010/wordprocessingInk" xmlns:wne="http://schemas.microsoft.com/office/word/2006/wordml" xmlns:wps="http://schemas.microsoft.com/office/word/2010/wordprocessingShape" mc:Ignorable="w14 w15 w16se w16cid w16 w16cex w16sdtdh w16sdtfl w16du wp14">
+<w:endnotes xmlns:wpc="http://schemas.microsoft.com/office/word/2010/wordprocessingCanvas" xmlns:cx="http://schemas.microsoft.com/office/drawing/2014/chartex" xmlns:mc="http://schemas.openxmlformats.org/markup-compatibility/2006" xmlns:o="urn:schemas-microsoft-com:office:office" xmlns:r="http://schemas.openxmlformats.org/officeDocument/2006/relationships" xmlns:m="http://schemas.openxmlformats.org/officeDocument/2006/math" xmlns:v="urn:schemas-microsoft-com:vml" xmlns:wp14="http://schemas.microsoft.com/office/word/2010/wordprocessingDrawing" xmlns:wp="http://schemas.openxmlformats.org/drawingml/2006/wordprocessingDrawing" xmlns:w10="urn:schemas-microsoft-com:office:word" xmlns:w="http://schemas.openxmlformats.org/wordprocessingml/2006/main" xmlns:w14="http://schemas.microsoft.com/office/word/2010/wordml" xmlns:w15="http://schemas.microsoft.com/office/word/2012/wordml" xmlns:w16se="http://schemas.microsoft.com/office/word/2015/wordml/symex" xmlns:wpg="http://schemas.microsoft.com/office/word/2010/wordprocessingGroup" xmlns:wpi="http://schemas.microsoft.com/office/word/2010/wordprocessingInk" xmlns:wne="http://schemas.microsoft.com/office/word/2006/wordml" xmlns:wps="http://schemas.microsoft.com/office/word/2010/wordprocessingShape" mc:Ignorable="w14 w15 w16se wp14">
   <w:endnote w:type="separator" w:id="-1">
     <w:p>
       <w:pPr>
@@ -2316,7 +1899,7 @@
 </file>
 
 <file path=word/footnotes.xml><?xml version="1.0" encoding="utf-8"?>
-<w:footnotes xmlns:wpc="http://schemas.microsoft.com/office/word/2010/wordprocessingCanvas" xmlns:cx="http://schemas.microsoft.com/office/drawing/2014/chartex" xmlns:cx1="http://schemas.microsoft.com/office/drawing/2015/9/8/chartex" xmlns:cx2="http://schemas.microsoft.com/office/drawing/2015/10/21/chartex" xmlns:cx3="http://schemas.microsoft.com/office/drawing/2016/5/9/chartex" xmlns:cx4="http://schemas.microsoft.com/office/drawing/2016/5/10/chartex" xmlns:cx5="http://schemas.microsoft.com/office/drawing/2016/5/11/chartex" xmlns:cx6="http://schemas.microsoft.com/office/drawing/2016/5/12/chartex" xmlns:cx7="http://schemas.microsoft.com/office/drawing/2016/5/13/chartex" xmlns:cx8="http://schemas.microsoft.com/office/drawing/2016/5/14/chartex" xmlns:mc="http://schemas.openxmlformats.org/markup-compatibility/2006" xmlns:aink="http://schemas.microsoft.com/office/drawing/2016/ink" xmlns:am3d="http://schemas.microsoft.com/office/drawing/2017/model3d" xmlns:o="urn:schemas-microsoft-com:office:office" xmlns:oel="http://schemas.microsoft.com/office/2019/extlst" xmlns:r="http://schemas.openxmlformats.org/officeDocument/2006/relationships" xmlns:m="http://schemas.openxmlformats.org/officeDocument/2006/math" xmlns:v="urn:schemas-microsoft-com:vml" xmlns:wp14="http://schemas.microsoft.com/office/word/2010/wordprocessingDrawing" xmlns:wp="http://schemas.openxmlformats.org/drawingml/2006/wordprocessingDrawing" xmlns:w10="urn:schemas-microsoft-com:office:word" xmlns:w="http://schemas.openxmlformats.org/wordprocessingml/2006/main" xmlns:w14="http://schemas.microsoft.com/office/word/2010/wordml" xmlns:w15="http://schemas.microsoft.com/office/word/2012/wordml" xmlns:w16cex="http://schemas.microsoft.com/office/word/2018/wordml/cex" xmlns:w16cid="http://schemas.microsoft.com/office/word/2016/wordml/cid" xmlns:w16="http://schemas.microsoft.com/office/word/2018/wordml" xmlns:w16du="http://schemas.microsoft.com/office/word/2023/wordml/word16du" xmlns:w16sdtdh="http://schemas.microsoft.com/office/word/2020/wordml/sdtdatahash" xmlns:w16sdtfl="http://schemas.microsoft.com/office/word/2024/wordml/sdtformatlock" xmlns:w16se="http://schemas.microsoft.com/office/word/2015/wordml/symex" xmlns:wpg="http://schemas.microsoft.com/office/word/2010/wordprocessingGroup" xmlns:wpi="http://schemas.microsoft.com/office/word/2010/wordprocessingInk" xmlns:wne="http://schemas.microsoft.com/office/word/2006/wordml" xmlns:wps="http://schemas.microsoft.com/office/word/2010/wordprocessingShape" mc:Ignorable="w14 w15 w16se w16cid w16 w16cex w16sdtdh w16sdtfl w16du wp14">
+<w:footnotes xmlns:wpc="http://schemas.microsoft.com/office/word/2010/wordprocessingCanvas" xmlns:cx="http://schemas.microsoft.com/office/drawing/2014/chartex" xmlns:mc="http://schemas.openxmlformats.org/markup-compatibility/2006" xmlns:o="urn:schemas-microsoft-com:office:office" xmlns:r="http://schemas.openxmlformats.org/officeDocument/2006/relationships" xmlns:m="http://schemas.openxmlformats.org/officeDocument/2006/math" xmlns:v="urn:schemas-microsoft-com:vml" xmlns:wp14="http://schemas.microsoft.com/office/word/2010/wordprocessingDrawing" xmlns:wp="http://schemas.openxmlformats.org/drawingml/2006/wordprocessingDrawing" xmlns:w10="urn:schemas-microsoft-com:office:word" xmlns:w="http://schemas.openxmlformats.org/wordprocessingml/2006/main" xmlns:w14="http://schemas.microsoft.com/office/word/2010/wordml" xmlns:w15="http://schemas.microsoft.com/office/word/2012/wordml" xmlns:w16se="http://schemas.microsoft.com/office/word/2015/wordml/symex" xmlns:wpg="http://schemas.microsoft.com/office/word/2010/wordprocessingGroup" xmlns:wpi="http://schemas.microsoft.com/office/word/2010/wordprocessingInk" xmlns:wne="http://schemas.microsoft.com/office/word/2006/wordml" xmlns:wps="http://schemas.microsoft.com/office/word/2010/wordprocessingShape" mc:Ignorable="w14 w15 w16se wp14">
   <w:footnote w:type="separator" w:id="-1">
     <w:p>
       <w:pPr>
@@ -2341,7 +1924,7 @@
 </file>
 
 <file path=word/header1.xml><?xml version="1.0" encoding="utf-8"?>
-<w:hdr xmlns:wpc="http://schemas.microsoft.com/office/word/2010/wordprocessingCanvas" xmlns:cx="http://schemas.microsoft.com/office/drawing/2014/chartex" xmlns:cx1="http://schemas.microsoft.com/office/drawing/2015/9/8/chartex" xmlns:cx2="http://schemas.microsoft.com/office/drawing/2015/10/21/chartex" xmlns:cx3="http://schemas.microsoft.com/office/drawing/2016/5/9/chartex" xmlns:cx4="http://schemas.microsoft.com/office/drawing/2016/5/10/chartex" xmlns:cx5="http://schemas.microsoft.com/office/drawing/2016/5/11/chartex" xmlns:cx6="http://schemas.microsoft.com/office/drawing/2016/5/12/chartex" xmlns:cx7="http://schemas.microsoft.com/office/drawing/2016/5/13/chartex" xmlns:cx8="http://schemas.microsoft.com/office/drawing/2016/5/14/chartex" xmlns:mc="http://schemas.openxmlformats.org/markup-compatibility/2006" xmlns:aink="http://schemas.microsoft.com/office/drawing/2016/ink" xmlns:am3d="http://schemas.microsoft.com/office/drawing/2017/model3d" xmlns:o="urn:schemas-microsoft-com:office:office" xmlns:oel="http://schemas.microsoft.com/office/2019/extlst" xmlns:r="http://schemas.openxmlformats.org/officeDocument/2006/relationships" xmlns:m="http://schemas.openxmlformats.org/officeDocument/2006/math" xmlns:v="urn:schemas-microsoft-com:vml" xmlns:wp14="http://schemas.microsoft.com/office/word/2010/wordprocessingDrawing" xmlns:wp="http://schemas.openxmlformats.org/drawingml/2006/wordprocessingDrawing" xmlns:w10="urn:schemas-microsoft-com:office:word" xmlns:w="http://schemas.openxmlformats.org/wordprocessingml/2006/main" xmlns:w14="http://schemas.microsoft.com/office/word/2010/wordml" xmlns:w15="http://schemas.microsoft.com/office/word/2012/wordml" xmlns:w16cex="http://schemas.microsoft.com/office/word/2018/wordml/cex" xmlns:w16cid="http://schemas.microsoft.com/office/word/2016/wordml/cid" xmlns:w16="http://schemas.microsoft.com/office/word/2018/wordml" xmlns:w16du="http://schemas.microsoft.com/office/word/2023/wordml/word16du" xmlns:w16sdtdh="http://schemas.microsoft.com/office/word/2020/wordml/sdtdatahash" xmlns:w16sdtfl="http://schemas.microsoft.com/office/word/2024/wordml/sdtformatlock" xmlns:w16se="http://schemas.microsoft.com/office/word/2015/wordml/symex" xmlns:wpg="http://schemas.microsoft.com/office/word/2010/wordprocessingGroup" xmlns:wpi="http://schemas.microsoft.com/office/word/2010/wordprocessingInk" xmlns:wne="http://schemas.microsoft.com/office/word/2006/wordml" xmlns:wps="http://schemas.microsoft.com/office/word/2010/wordprocessingShape" mc:Ignorable="w14 w15 w16se w16cid w16 w16cex w16sdtdh w16sdtfl w16du wp14">
+<w:hdr xmlns:wpc="http://schemas.microsoft.com/office/word/2010/wordprocessingCanvas" xmlns:cx="http://schemas.microsoft.com/office/drawing/2014/chartex" xmlns:mc="http://schemas.openxmlformats.org/markup-compatibility/2006" xmlns:o="urn:schemas-microsoft-com:office:office" xmlns:r="http://schemas.openxmlformats.org/officeDocument/2006/relationships" xmlns:m="http://schemas.openxmlformats.org/officeDocument/2006/math" xmlns:v="urn:schemas-microsoft-com:vml" xmlns:wp14="http://schemas.microsoft.com/office/word/2010/wordprocessingDrawing" xmlns:wp="http://schemas.openxmlformats.org/drawingml/2006/wordprocessingDrawing" xmlns:w10="urn:schemas-microsoft-com:office:word" xmlns:w="http://schemas.openxmlformats.org/wordprocessingml/2006/main" xmlns:w14="http://schemas.microsoft.com/office/word/2010/wordml" xmlns:w15="http://schemas.microsoft.com/office/word/2012/wordml" xmlns:w16se="http://schemas.microsoft.com/office/word/2015/wordml/symex" xmlns:wpg="http://schemas.microsoft.com/office/word/2010/wordprocessingGroup" xmlns:wpi="http://schemas.microsoft.com/office/word/2010/wordprocessingInk" xmlns:wne="http://schemas.microsoft.com/office/word/2006/wordml" xmlns:wps="http://schemas.microsoft.com/office/word/2010/wordprocessingShape" mc:Ignorable="w14 w15 w16se wp14">
   <w:p>
     <w:pPr>
       <w:pStyle w:val="Header"/>
@@ -2481,7 +2064,7 @@
 </file>
 
 <file path=word/numbering.xml><?xml version="1.0" encoding="utf-8"?>
-<w:numbering xmlns:wpc="http://schemas.microsoft.com/office/word/2010/wordprocessingCanvas" xmlns:cx="http://schemas.microsoft.com/office/drawing/2014/chartex" xmlns:cx1="http://schemas.microsoft.com/office/drawing/2015/9/8/chartex" xmlns:cx2="http://schemas.microsoft.com/office/drawing/2015/10/21/chartex" xmlns:cx3="http://schemas.microsoft.com/office/drawing/2016/5/9/chartex" xmlns:cx4="http://schemas.microsoft.com/office/drawing/2016/5/10/chartex" xmlns:cx5="http://schemas.microsoft.com/office/drawing/2016/5/11/chartex" xmlns:cx6="http://schemas.microsoft.com/office/drawing/2016/5/12/chartex" xmlns:cx7="http://schemas.microsoft.com/office/drawing/2016/5/13/chartex" xmlns:cx8="http://schemas.microsoft.com/office/drawing/2016/5/14/chartex" xmlns:mc="http://schemas.openxmlformats.org/markup-compatibility/2006" xmlns:aink="http://schemas.microsoft.com/office/drawing/2016/ink" xmlns:am3d="http://schemas.microsoft.com/office/drawing/2017/model3d" xmlns:o="urn:schemas-microsoft-com:office:office" xmlns:oel="http://schemas.microsoft.com/office/2019/extlst" xmlns:r="http://schemas.openxmlformats.org/officeDocument/2006/relationships" xmlns:m="http://schemas.openxmlformats.org/officeDocument/2006/math" xmlns:v="urn:schemas-microsoft-com:vml" xmlns:wp14="http://schemas.microsoft.com/office/word/2010/wordprocessingDrawing" xmlns:wp="http://schemas.openxmlformats.org/drawingml/2006/wordprocessingDrawing" xmlns:w10="urn:schemas-microsoft-com:office:word" xmlns:w="http://schemas.openxmlformats.org/wordprocessingml/2006/main" xmlns:w14="http://schemas.microsoft.com/office/word/2010/wordml" xmlns:w15="http://schemas.microsoft.com/office/word/2012/wordml" xmlns:w16cex="http://schemas.microsoft.com/office/word/2018/wordml/cex" xmlns:w16cid="http://schemas.microsoft.com/office/word/2016/wordml/cid" xmlns:w16="http://schemas.microsoft.com/office/word/2018/wordml" xmlns:w16du="http://schemas.microsoft.com/office/word/2023/wordml/word16du" xmlns:w16sdtdh="http://schemas.microsoft.com/office/word/2020/wordml/sdtdatahash" xmlns:w16sdtfl="http://schemas.microsoft.com/office/word/2024/wordml/sdtformatlock" xmlns:w16se="http://schemas.microsoft.com/office/word/2015/wordml/symex" xmlns:wpg="http://schemas.microsoft.com/office/word/2010/wordprocessingGroup" xmlns:wpi="http://schemas.microsoft.com/office/word/2010/wordprocessingInk" xmlns:wne="http://schemas.microsoft.com/office/word/2006/wordml" xmlns:wps="http://schemas.microsoft.com/office/word/2010/wordprocessingShape" mc:Ignorable="w14 w15 w16se w16cid w16 w16cex w16sdtdh w16sdtfl w16du wp14">
+<w:numbering xmlns:wpc="http://schemas.microsoft.com/office/word/2010/wordprocessingCanvas" xmlns:cx="http://schemas.microsoft.com/office/drawing/2014/chartex" xmlns:mc="http://schemas.openxmlformats.org/markup-compatibility/2006" xmlns:o="urn:schemas-microsoft-com:office:office" xmlns:r="http://schemas.openxmlformats.org/officeDocument/2006/relationships" xmlns:m="http://schemas.openxmlformats.org/officeDocument/2006/math" xmlns:v="urn:schemas-microsoft-com:vml" xmlns:wp14="http://schemas.microsoft.com/office/word/2010/wordprocessingDrawing" xmlns:wp="http://schemas.openxmlformats.org/drawingml/2006/wordprocessingDrawing" xmlns:w10="urn:schemas-microsoft-com:office:word" xmlns:w="http://schemas.openxmlformats.org/wordprocessingml/2006/main" xmlns:w14="http://schemas.microsoft.com/office/word/2010/wordml" xmlns:w15="http://schemas.microsoft.com/office/word/2012/wordml" xmlns:w16se="http://schemas.microsoft.com/office/word/2015/wordml/symex" xmlns:wpg="http://schemas.microsoft.com/office/word/2010/wordprocessingGroup" xmlns:wpi="http://schemas.microsoft.com/office/word/2010/wordprocessingInk" xmlns:wne="http://schemas.microsoft.com/office/word/2006/wordml" xmlns:wps="http://schemas.microsoft.com/office/word/2010/wordprocessingShape" mc:Ignorable="w14 w15 w16se wp14">
   <w:abstractNum w:abstractNumId="0" w15:restartNumberingAfterBreak="0">
     <w:nsid w:val="0E237E9C"/>
     <w:multiLevelType w:val="hybridMultilevel"/>
@@ -2821,20 +2404,20 @@
       </w:rPr>
     </w:lvl>
   </w:abstractNum>
-  <w:num w:numId="1" w16cid:durableId="2119058259">
+  <w:num w:numId="1">
     <w:abstractNumId w:val="0"/>
   </w:num>
-  <w:num w:numId="2" w16cid:durableId="968392174">
+  <w:num w:numId="2">
     <w:abstractNumId w:val="2"/>
   </w:num>
-  <w:num w:numId="3" w16cid:durableId="419834877">
+  <w:num w:numId="3">
     <w:abstractNumId w:val="1"/>
   </w:num>
 </w:numbering>
 </file>
 
 <file path=word/styles.xml><?xml version="1.0" encoding="utf-8"?>
-<w:styles xmlns:mc="http://schemas.openxmlformats.org/markup-compatibility/2006" xmlns:r="http://schemas.openxmlformats.org/officeDocument/2006/relationships" xmlns:w="http://schemas.openxmlformats.org/wordprocessingml/2006/main" xmlns:w14="http://schemas.microsoft.com/office/word/2010/wordml" xmlns:w15="http://schemas.microsoft.com/office/word/2012/wordml" xmlns:w16cex="http://schemas.microsoft.com/office/word/2018/wordml/cex" xmlns:w16cid="http://schemas.microsoft.com/office/word/2016/wordml/cid" xmlns:w16="http://schemas.microsoft.com/office/word/2018/wordml" xmlns:w16du="http://schemas.microsoft.com/office/word/2023/wordml/word16du" xmlns:w16sdtdh="http://schemas.microsoft.com/office/word/2020/wordml/sdtdatahash" xmlns:w16sdtfl="http://schemas.microsoft.com/office/word/2024/wordml/sdtformatlock" xmlns:w16se="http://schemas.microsoft.com/office/word/2015/wordml/symex" mc:Ignorable="w14 w15 w16se w16cid w16 w16cex w16sdtdh w16sdtfl w16du">
+<w:styles xmlns:mc="http://schemas.openxmlformats.org/markup-compatibility/2006" xmlns:r="http://schemas.openxmlformats.org/officeDocument/2006/relationships" xmlns:w="http://schemas.openxmlformats.org/wordprocessingml/2006/main" xmlns:w14="http://schemas.microsoft.com/office/word/2010/wordml" xmlns:w15="http://schemas.microsoft.com/office/word/2012/wordml" xmlns:w16se="http://schemas.microsoft.com/office/word/2015/wordml/symex" mc:Ignorable="w14 w15 w16se">
   <w:docDefaults>
     <w:rPrDefault>
       <w:rPr>
@@ -2852,7 +2435,7 @@
       </w:pPr>
     </w:pPrDefault>
   </w:docDefaults>
-  <w:latentStyles w:defLockedState="0" w:defUIPriority="99" w:defSemiHidden="0" w:defUnhideWhenUsed="0" w:defQFormat="0" w:count="376">
+  <w:latentStyles w:defLockedState="0" w:defUIPriority="99" w:defSemiHidden="0" w:defUnhideWhenUsed="0" w:defQFormat="0" w:count="371">
     <w:lsdException w:name="Normal" w:uiPriority="0" w:qFormat="1"/>
     <w:lsdException w:name="heading 1" w:uiPriority="9" w:qFormat="1"/>
     <w:lsdException w:name="heading 2" w:semiHidden="1" w:uiPriority="9" w:unhideWhenUsed="1" w:qFormat="1"/>
@@ -3224,11 +2807,6 @@
     <w:lsdException w:name="List Table 5 Dark Accent 6" w:uiPriority="50"/>
     <w:lsdException w:name="List Table 6 Colorful Accent 6" w:uiPriority="51"/>
     <w:lsdException w:name="List Table 7 Colorful Accent 6" w:uiPriority="52"/>
-    <w:lsdException w:name="Mention" w:semiHidden="1" w:unhideWhenUsed="1"/>
-    <w:lsdException w:name="Smart Hyperlink" w:semiHidden="1" w:unhideWhenUsed="1"/>
-    <w:lsdException w:name="Hashtag" w:semiHidden="1" w:unhideWhenUsed="1"/>
-    <w:lsdException w:name="Unresolved Mention" w:semiHidden="1" w:unhideWhenUsed="1"/>
-    <w:lsdException w:name="Smart Link" w:semiHidden="1" w:unhideWhenUsed="1"/>
   </w:latentStyles>
   <w:style w:type="paragraph" w:default="1" w:styleId="Normal">
     <w:name w:val="Normal"/>
@@ -3761,7 +3339,7 @@
       <w:u w:val="single"/>
     </w:rPr>
   </w:style>
-  <w:style w:type="character" w:styleId="UnresolvedMention">
+  <w:style w:type="character" w:customStyle="1" w:styleId="UnresolvedMention">
     <w:name w:val="Unresolved Mention"/>
     <w:basedOn w:val="DefaultParagraphFont"/>
     <w:uiPriority w:val="99"/>

</xml_diff>